<commit_message>
feat: create config server microservice
</commit_message>
<xml_diff>
--- a/docs/Testing.docx
+++ b/docs/Testing.docx
@@ -2670,6 +2670,7 @@
       </w:pPr>
       <w:r>
         <w:rPr>
+          <w:noProof/>
           <w:lang w:val="es-ES"/>
         </w:rPr>
         <w:lastRenderedPageBreak/>
@@ -2772,10 +2773,10 @@
           <w:lang w:val="es-ES"/>
         </w:rPr>
         <w:drawing>
-          <wp:inline distT="0" distB="0" distL="0" distR="0" wp14:anchorId="38364E88" wp14:editId="372FABD7">
-            <wp:extent cx="5400040" cy="1189355"/>
-            <wp:effectExtent l="0" t="0" r="0" b="0"/>
-            <wp:docPr id="20" name="Imagen 20"/>
+          <wp:inline distT="0" distB="0" distL="0" distR="0" wp14:anchorId="28C32EC0" wp14:editId="0BD9C803">
+            <wp:extent cx="5400040" cy="1939925"/>
+            <wp:effectExtent l="0" t="0" r="0" b="3175"/>
+            <wp:docPr id="23" name="Imagen 23"/>
             <wp:cNvGraphicFramePr>
               <a:graphicFrameLocks xmlns:a="http://schemas.openxmlformats.org/drawingml/2006/main" noChangeAspect="1"/>
             </wp:cNvGraphicFramePr>
@@ -2795,7 +2796,7 @@
                   <pic:spPr>
                     <a:xfrm>
                       <a:off x="0" y="0"/>
-                      <a:ext cx="5400040" cy="1189355"/>
+                      <a:ext cx="5400040" cy="1939925"/>
                     </a:xfrm>
                     <a:prstGeom prst="rect">
                       <a:avLst/>
@@ -2832,6 +2833,7 @@
       </w:pPr>
       <w:r>
         <w:rPr>
+          <w:noProof/>
           <w:lang w:val="es-ES"/>
         </w:rPr>
         <w:drawing>
@@ -2953,15 +2955,22 @@
           <w:lang w:val="es-ES"/>
         </w:rPr>
       </w:pPr>
+    </w:p>
+    <w:p>
+      <w:pPr>
+        <w:rPr>
+          <w:lang w:val="es-ES"/>
+        </w:rPr>
+      </w:pPr>
       <w:r>
         <w:rPr>
           <w:lang w:val="es-ES"/>
         </w:rPr>
         <w:drawing>
-          <wp:inline distT="0" distB="0" distL="0" distR="0" wp14:anchorId="5F2A9CDA" wp14:editId="723BAF9C">
-            <wp:extent cx="5400040" cy="906780"/>
-            <wp:effectExtent l="0" t="0" r="0" b="7620"/>
-            <wp:docPr id="22" name="Imagen 22"/>
+          <wp:inline distT="0" distB="0" distL="0" distR="0" wp14:anchorId="1772A561" wp14:editId="5D8EE2C1">
+            <wp:extent cx="5400040" cy="876935"/>
+            <wp:effectExtent l="0" t="0" r="0" b="0"/>
+            <wp:docPr id="24" name="Imagen 24"/>
             <wp:cNvGraphicFramePr>
               <a:graphicFrameLocks xmlns:a="http://schemas.openxmlformats.org/drawingml/2006/main" noChangeAspect="1"/>
             </wp:cNvGraphicFramePr>
@@ -2981,7 +2990,7 @@
                   <pic:spPr>
                     <a:xfrm>
                       <a:off x="0" y="0"/>
-                      <a:ext cx="5400040" cy="906780"/>
+                      <a:ext cx="5400040" cy="876935"/>
                     </a:xfrm>
                     <a:prstGeom prst="rect">
                       <a:avLst/>
@@ -2992,6 +3001,27 @@
             </a:graphic>
           </wp:inline>
         </w:drawing>
+      </w:r>
+    </w:p>
+    <w:p>
+      <w:pPr>
+        <w:rPr>
+          <w:lang w:val="es-ES"/>
+        </w:rPr>
+      </w:pPr>
+    </w:p>
+    <w:p>
+      <w:pPr>
+        <w:rPr>
+          <w:lang w:val="es-ES"/>
+        </w:rPr>
+      </w:pPr>
+      <w:r>
+        <w:rPr>
+          <w:lang w:val="es-ES"/>
+        </w:rPr>
+        <w:lastRenderedPageBreak/>
+        <w:t xml:space="preserve">Pruebas </w:t>
       </w:r>
     </w:p>
     <w:p>

</xml_diff>